<commit_message>
Horaires : week-end et jours fériés indisponibles
- Horaires affichés « Week-end et jours fériés : Indisponible »
- horairesIntervention : « hors jours fériés et congés annuels » (CGV,
  devis, contrat)
- Majoration « jours fériés » retirée (tarifs, CGV, devis) ; modèles régénérés

Co-Authored-By: Claude Opus 5.5 <noreply@anthropic.com>
Claude-Session: https://claude.ai/code/session_01RpHF8nrcPTLKtwPSNGyhP8
</commit_message>
<xml_diff>
--- a/documents/modele-devis.docx
+++ b/documents/modele-devis.docx
@@ -740,7 +740,7 @@
           <w:sz w:val="16"/>
           <w:szCs w:val="16"/>
         </w:rPr>
-        <w:t xml:space="preserve">Interventions du lundi au vendredi, de 8 h à 18 h, hors congés annuels. Durée minimale : 2 heures pour le ménage, 1 heure pour le soutien scolaire.</w:t>
+        <w:t xml:space="preserve">Interventions du lundi au vendredi, de 8 h à 18 h, hors jours fériés et congés annuels. Durée minimale : 2 heures pour le ménage, 1 heure pour le soutien scolaire.</w:t>
       </w:r>
     </w:p>
     <w:tbl>
@@ -1360,7 +1360,7 @@
                 <w:sz w:val="18"/>
                 <w:szCs w:val="18"/>
               </w:rPr>
-              <w:t xml:space="preserve">Majorations éventuelles (jours fériés, intervention urgente)</w:t>
+              <w:t xml:space="preserve">Majorations éventuelles (intervention urgente)</w:t>
             </w:r>
           </w:p>
         </w:tc>

</xml_diff>